<commit_message>
I tryed so hard
</commit_message>
<xml_diff>
--- a/Отчёт 3. Лабораторная работа.docx
+++ b/Отчёт 3. Лабораторная работа.docx
@@ -2707,6 +2707,62 @@
       </w:pPr>
       <w:r>
         <w:rPr>
+          <w:rFonts w:ascii="Times New Roman" w:hAnsi="Times New Roman"/>
+          <w:sz w:val="24"/>
+          <w:szCs w:val="22"/>
+        </w:rPr>
+        <w:drawing>
+          <wp:anchor distT="0" distB="0" distL="114300" distR="114300" simplePos="0" relativeHeight="251681792" behindDoc="0" locked="0" layoutInCell="1" allowOverlap="1" wp14:anchorId="74BD23CF" wp14:editId="39558F72">
+            <wp:simplePos x="0" y="0"/>
+            <wp:positionH relativeFrom="margin">
+              <wp:align>center</wp:align>
+            </wp:positionH>
+            <wp:positionV relativeFrom="paragraph">
+              <wp:posOffset>604520</wp:posOffset>
+            </wp:positionV>
+            <wp:extent cx="2534004" cy="971686"/>
+            <wp:effectExtent l="0" t="0" r="0" b="0"/>
+            <wp:wrapTopAndBottom/>
+            <wp:docPr id="14" name="Picture 14"/>
+            <wp:cNvGraphicFramePr>
+              <a:graphicFrameLocks xmlns:a="http://schemas.openxmlformats.org/drawingml/2006/main" noChangeAspect="1"/>
+            </wp:cNvGraphicFramePr>
+            <a:graphic xmlns:a="http://schemas.openxmlformats.org/drawingml/2006/main">
+              <a:graphicData uri="http://schemas.openxmlformats.org/drawingml/2006/picture">
+                <pic:pic xmlns:pic="http://schemas.openxmlformats.org/drawingml/2006/picture">
+                  <pic:nvPicPr>
+                    <pic:cNvPr id="1" name=""/>
+                    <pic:cNvPicPr/>
+                  </pic:nvPicPr>
+                  <pic:blipFill>
+                    <a:blip r:embed="rId8">
+                      <a:extLst>
+                        <a:ext uri="{28A0092B-C50C-407E-A947-70E740481C1C}">
+                          <a14:useLocalDpi xmlns:a14="http://schemas.microsoft.com/office/drawing/2010/main" val="0"/>
+                        </a:ext>
+                      </a:extLst>
+                    </a:blip>
+                    <a:stretch>
+                      <a:fillRect/>
+                    </a:stretch>
+                  </pic:blipFill>
+                  <pic:spPr>
+                    <a:xfrm>
+                      <a:off x="0" y="0"/>
+                      <a:ext cx="2534004" cy="971686"/>
+                    </a:xfrm>
+                    <a:prstGeom prst="rect">
+                      <a:avLst/>
+                    </a:prstGeom>
+                  </pic:spPr>
+                </pic:pic>
+              </a:graphicData>
+            </a:graphic>
+          </wp:anchor>
+        </w:drawing>
+      </w:r>
+      <w:r>
+        <w:rPr>
           <w:rFonts w:ascii="Times New Roman" w:eastAsiaTheme="majorEastAsia" w:hAnsi="Times New Roman"/>
           <w:noProof/>
           <w:sz w:val="24"/>
@@ -2787,7 +2843,13 @@
                               <w:rPr>
                                 <w:rFonts w:ascii="Times New Roman" w:hAnsi="Times New Roman"/>
                               </w:rPr>
-                              <w:t>Вид рукводства</w:t>
+                              <w:t xml:space="preserve">Вид </w:t>
+                            </w:r>
+                            <w:r>
+                              <w:rPr>
+                                <w:rFonts w:ascii="Times New Roman" w:hAnsi="Times New Roman"/>
+                              </w:rPr>
+                              <w:t>консольного приложения</w:t>
                             </w:r>
                           </w:p>
                         </w:txbxContent>
@@ -2845,7 +2907,13 @@
                         <w:rPr>
                           <w:rFonts w:ascii="Times New Roman" w:hAnsi="Times New Roman"/>
                         </w:rPr>
-                        <w:t>Вид рукводства</w:t>
+                        <w:t xml:space="preserve">Вид </w:t>
+                      </w:r>
+                      <w:r>
+                        <w:rPr>
+                          <w:rFonts w:ascii="Times New Roman" w:hAnsi="Times New Roman"/>
+                        </w:rPr>
+                        <w:t>консольного приложения</w:t>
                       </w:r>
                     </w:p>
                   </w:txbxContent>
@@ -2862,62 +2930,6 @@
           <w:sz w:val="24"/>
           <w:szCs w:val="22"/>
         </w:rPr>
-        <w:drawing>
-          <wp:anchor distT="0" distB="0" distL="114300" distR="114300" simplePos="0" relativeHeight="251675648" behindDoc="0" locked="0" layoutInCell="1" allowOverlap="1" wp14:anchorId="11D8DA10" wp14:editId="715699DC">
-            <wp:simplePos x="0" y="0"/>
-            <wp:positionH relativeFrom="margin">
-              <wp:align>center</wp:align>
-            </wp:positionH>
-            <wp:positionV relativeFrom="paragraph">
-              <wp:posOffset>642620</wp:posOffset>
-            </wp:positionV>
-            <wp:extent cx="3381375" cy="1019175"/>
-            <wp:effectExtent l="0" t="0" r="9525" b="9525"/>
-            <wp:wrapTopAndBottom/>
-            <wp:docPr id="6" name="Picture 6"/>
-            <wp:cNvGraphicFramePr>
-              <a:graphicFrameLocks xmlns:a="http://schemas.openxmlformats.org/drawingml/2006/main" noChangeAspect="1"/>
-            </wp:cNvGraphicFramePr>
-            <a:graphic xmlns:a="http://schemas.openxmlformats.org/drawingml/2006/main">
-              <a:graphicData uri="http://schemas.openxmlformats.org/drawingml/2006/picture">
-                <pic:pic xmlns:pic="http://schemas.openxmlformats.org/drawingml/2006/picture">
-                  <pic:nvPicPr>
-                    <pic:cNvPr id="1" name=""/>
-                    <pic:cNvPicPr/>
-                  </pic:nvPicPr>
-                  <pic:blipFill>
-                    <a:blip r:embed="rId8">
-                      <a:extLst>
-                        <a:ext uri="{28A0092B-C50C-407E-A947-70E740481C1C}">
-                          <a14:useLocalDpi xmlns:a14="http://schemas.microsoft.com/office/drawing/2010/main" val="0"/>
-                        </a:ext>
-                      </a:extLst>
-                    </a:blip>
-                    <a:stretch>
-                      <a:fillRect/>
-                    </a:stretch>
-                  </pic:blipFill>
-                  <pic:spPr>
-                    <a:xfrm>
-                      <a:off x="0" y="0"/>
-                      <a:ext cx="3381375" cy="1019175"/>
-                    </a:xfrm>
-                    <a:prstGeom prst="rect">
-                      <a:avLst/>
-                    </a:prstGeom>
-                  </pic:spPr>
-                </pic:pic>
-              </a:graphicData>
-            </a:graphic>
-          </wp:anchor>
-        </w:drawing>
-      </w:r>
-      <w:r>
-        <w:rPr>
-          <w:rFonts w:ascii="Times New Roman" w:hAnsi="Times New Roman"/>
-          <w:sz w:val="24"/>
-          <w:szCs w:val="22"/>
-        </w:rPr>
         <w:t>После запуска программы вы увидите меню с четырьмя пунктами. Вам нужно последовательно выполнять действия, чтобы получить результат вычислений.</w:t>
       </w:r>
     </w:p>
@@ -3187,225 +3199,6 @@
       </w:pPr>
       <w:r>
         <w:rPr>
-          <w:rFonts w:ascii="Times New Roman" w:hAnsi="Times New Roman"/>
-          <w:sz w:val="24"/>
-          <w:szCs w:val="22"/>
-          <w:u w:val="single"/>
-        </w:rPr>
-        <w:t>Шаг 3: Задание значений переменных</w:t>
-      </w:r>
-    </w:p>
-    <w:p>
-      <w:pPr>
-        <w:spacing w:line="360" w:lineRule="auto"/>
-        <w:jc w:val="both"/>
-        <w:rPr>
-          <w:rFonts w:ascii="Times New Roman" w:hAnsi="Times New Roman"/>
-          <w:sz w:val="24"/>
-          <w:szCs w:val="22"/>
-        </w:rPr>
-      </w:pPr>
-      <w:r>
-        <w:rPr>
-          <w:rFonts w:ascii="Times New Roman" w:hAnsi="Times New Roman"/>
-          <w:sz w:val="24"/>
-          <w:szCs w:val="22"/>
-        </w:rPr>
-        <w:t>Теперь нужно указать, какие числа соответствуют переменным в вашем выражении. Выберите пункт "Ввести значения переменных".</w:t>
-      </w:r>
-    </w:p>
-    <w:p>
-      <w:pPr>
-        <w:spacing w:line="360" w:lineRule="auto"/>
-        <w:jc w:val="both"/>
-        <w:rPr>
-          <w:rFonts w:ascii="Times New Roman" w:hAnsi="Times New Roman"/>
-          <w:sz w:val="24"/>
-          <w:szCs w:val="22"/>
-        </w:rPr>
-      </w:pPr>
-      <w:r>
-        <w:rPr>
-          <w:rFonts w:ascii="Times New Roman" w:hAnsi="Times New Roman"/>
-          <w:sz w:val="24"/>
-          <w:szCs w:val="22"/>
-        </w:rPr>
-        <w:t>Для каждой переменной:</w:t>
-      </w:r>
-    </w:p>
-    <w:p>
-      <w:pPr>
-        <w:spacing w:line="360" w:lineRule="auto"/>
-        <w:jc w:val="both"/>
-        <w:rPr>
-          <w:rFonts w:ascii="Times New Roman" w:hAnsi="Times New Roman"/>
-          <w:sz w:val="24"/>
-          <w:szCs w:val="22"/>
-        </w:rPr>
-      </w:pPr>
-      <w:r>
-        <w:rPr>
-          <w:rFonts w:ascii="Times New Roman" w:hAnsi="Times New Roman"/>
-          <w:sz w:val="24"/>
-          <w:szCs w:val="22"/>
-        </w:rPr>
-        <w:t>Введите имя переменной (одну букву)</w:t>
-      </w:r>
-    </w:p>
-    <w:p>
-      <w:pPr>
-        <w:spacing w:line="360" w:lineRule="auto"/>
-        <w:jc w:val="both"/>
-        <w:rPr>
-          <w:rFonts w:ascii="Times New Roman" w:hAnsi="Times New Roman"/>
-          <w:sz w:val="24"/>
-          <w:szCs w:val="22"/>
-        </w:rPr>
-      </w:pPr>
-      <w:r>
-        <w:rPr>
-          <w:rFonts w:ascii="Times New Roman" w:hAnsi="Times New Roman"/>
-          <w:sz w:val="24"/>
-          <w:szCs w:val="22"/>
-        </w:rPr>
-        <w:t>Введите ее числовое значение</w:t>
-      </w:r>
-    </w:p>
-    <w:p>
-      <w:pPr>
-        <w:spacing w:line="360" w:lineRule="auto"/>
-        <w:jc w:val="both"/>
-        <w:rPr>
-          <w:rFonts w:ascii="Times New Roman" w:hAnsi="Times New Roman"/>
-          <w:sz w:val="24"/>
-          <w:szCs w:val="22"/>
-        </w:rPr>
-      </w:pPr>
-      <w:r>
-        <w:rPr>
-          <w:rFonts w:ascii="Times New Roman" w:hAnsi="Times New Roman"/>
-          <w:sz w:val="24"/>
-          <w:szCs w:val="22"/>
-        </w:rPr>
-        <w:t>Повторите для всех переменных, которые есть в выражении</w:t>
-      </w:r>
-    </w:p>
-    <w:p>
-      <w:pPr>
-        <w:spacing w:line="360" w:lineRule="auto"/>
-        <w:jc w:val="both"/>
-        <w:rPr>
-          <w:rFonts w:ascii="Times New Roman" w:hAnsi="Times New Roman"/>
-          <w:sz w:val="24"/>
-          <w:szCs w:val="22"/>
-        </w:rPr>
-      </w:pPr>
-      <w:r>
-        <w:rPr>
-          <w:rFonts w:ascii="Times New Roman" w:hAnsi="Times New Roman"/>
-          <w:sz w:val="24"/>
-          <w:szCs w:val="22"/>
-        </w:rPr>
-        <w:lastRenderedPageBreak/>
-        <w:t>Для завершения ввода введите </w:t>
-      </w:r>
-      <w:r>
-        <w:rPr>
-          <w:rFonts w:ascii="Times New Roman" w:eastAsiaTheme="majorEastAsia" w:hAnsi="Times New Roman"/>
-          <w:sz w:val="24"/>
-          <w:szCs w:val="22"/>
-        </w:rPr>
-        <w:t>0</w:t>
-      </w:r>
-    </w:p>
-    <w:p>
-      <w:pPr>
-        <w:spacing w:line="360" w:lineRule="auto"/>
-        <w:jc w:val="both"/>
-        <w:rPr>
-          <w:rFonts w:ascii="Times New Roman" w:hAnsi="Times New Roman"/>
-          <w:sz w:val="24"/>
-          <w:szCs w:val="22"/>
-        </w:rPr>
-      </w:pPr>
-      <w:r>
-        <w:rPr>
-          <w:rFonts w:ascii="Times New Roman" w:hAnsi="Times New Roman"/>
-          <w:sz w:val="24"/>
-          <w:szCs w:val="22"/>
-        </w:rPr>
-        <w:t>Если вы попробуете задать значение для символа, который не является строчной английской буквой, программа сообщит об ошибке.</w:t>
-      </w:r>
-      <w:r>
-        <w:rPr>
-          <w:rFonts w:ascii="Times New Roman" w:hAnsi="Times New Roman"/>
-          <w:sz w:val="24"/>
-          <w:szCs w:val="22"/>
-        </w:rPr>
-        <w:t xml:space="preserve"> Е</w:t>
-      </w:r>
-      <w:r>
-        <w:rPr>
-          <w:rFonts w:ascii="Times New Roman" w:hAnsi="Times New Roman"/>
-          <w:sz w:val="24"/>
-          <w:szCs w:val="22"/>
-        </w:rPr>
-        <w:t>сли в выражении есть переменные, которые вы не задали, при вычислении они будут считаться равными нулю.</w:t>
-      </w:r>
-    </w:p>
-    <w:p>
-      <w:pPr>
-        <w:spacing w:line="360" w:lineRule="auto"/>
-        <w:ind w:firstLine="708"/>
-        <w:jc w:val="both"/>
-        <w:rPr>
-          <w:rFonts w:ascii="Times New Roman" w:hAnsi="Times New Roman"/>
-          <w:sz w:val="24"/>
-          <w:szCs w:val="22"/>
-          <w:u w:val="single"/>
-        </w:rPr>
-      </w:pPr>
-      <w:r>
-        <w:rPr>
-          <w:rFonts w:ascii="Times New Roman" w:hAnsi="Times New Roman"/>
-          <w:sz w:val="24"/>
-          <w:szCs w:val="22"/>
-          <w:u w:val="single"/>
-        </w:rPr>
-        <w:t>Шаг 4: Вычисление результата</w:t>
-      </w:r>
-    </w:p>
-    <w:p>
-      <w:pPr>
-        <w:spacing w:line="360" w:lineRule="auto"/>
-        <w:jc w:val="both"/>
-        <w:rPr>
-          <w:rFonts w:ascii="Times New Roman" w:hAnsi="Times New Roman"/>
-          <w:sz w:val="24"/>
-          <w:szCs w:val="22"/>
-        </w:rPr>
-      </w:pPr>
-      <w:r>
-        <w:rPr>
-          <w:rFonts w:ascii="Times New Roman" w:hAnsi="Times New Roman"/>
-          <w:sz w:val="24"/>
-          <w:szCs w:val="22"/>
-        </w:rPr>
-        <w:t>Когда все готово, выберите пункт "Вычислить выражение". Программа подставит заданные значения переменных, выполнит вычисления и покажет результат.</w:t>
-      </w:r>
-    </w:p>
-    <w:p>
-      <w:pPr>
-        <w:spacing w:line="360" w:lineRule="auto"/>
-        <w:jc w:val="both"/>
-        <w:rPr>
-          <w:rFonts w:ascii="Times New Roman" w:hAnsi="Times New Roman"/>
-          <w:sz w:val="24"/>
-          <w:szCs w:val="22"/>
-        </w:rPr>
-      </w:pPr>
-      <w:r>
-        <w:rPr>
           <w:rFonts w:ascii="Times New Roman" w:eastAsiaTheme="majorEastAsia" w:hAnsi="Times New Roman"/>
           <w:noProof/>
           <w:sz w:val="24"/>
@@ -3414,18 +3207,18 @@
         <mc:AlternateContent>
           <mc:Choice Requires="wps">
             <w:drawing>
-              <wp:anchor distT="45720" distB="45720" distL="114300" distR="114300" simplePos="0" relativeHeight="251680768" behindDoc="0" locked="0" layoutInCell="1" allowOverlap="1" wp14:anchorId="4148A3EA" wp14:editId="066C3C94">
+              <wp:anchor distT="45720" distB="45720" distL="114300" distR="114300" simplePos="0" relativeHeight="251684864" behindDoc="0" locked="0" layoutInCell="1" allowOverlap="1" wp14:anchorId="5BD06AE0" wp14:editId="66BC2263">
                 <wp:simplePos x="0" y="0"/>
                 <wp:positionH relativeFrom="margin">
                   <wp:align>center</wp:align>
                 </wp:positionH>
                 <wp:positionV relativeFrom="paragraph">
-                  <wp:posOffset>989330</wp:posOffset>
+                  <wp:posOffset>1035050</wp:posOffset>
                 </wp:positionV>
                 <wp:extent cx="3076575" cy="1404620"/>
                 <wp:effectExtent l="0" t="0" r="28575" b="24765"/>
                 <wp:wrapTopAndBottom/>
-                <wp:docPr id="12" name="Text Box 2"/>
+                <wp:docPr id="16" name="Text Box 2"/>
                 <wp:cNvGraphicFramePr>
                   <a:graphicFrameLocks xmlns:a="http://schemas.openxmlformats.org/drawingml/2006/main"/>
                 </wp:cNvGraphicFramePr>
@@ -3499,7 +3292,13 @@
                               <w:rPr>
                                 <w:rFonts w:ascii="Times New Roman" w:hAnsi="Times New Roman"/>
                               </w:rPr>
-                              <w:t>Вывод результата</w:t>
+                              <w:t>В</w:t>
+                            </w:r>
+                            <w:r>
+                              <w:rPr>
+                                <w:rFonts w:ascii="Times New Roman" w:hAnsi="Times New Roman"/>
+                              </w:rPr>
+                              <w:t>вод значений</w:t>
                             </w:r>
                           </w:p>
                         </w:txbxContent>
@@ -3521,7 +3320,7 @@
           </mc:Choice>
           <mc:Fallback>
             <w:pict>
-              <v:shape w14:anchorId="4148A3EA" id="_x0000_s1027" type="#_x0000_t202" style="position:absolute;left:0;text-align:left;margin-left:0;margin-top:77.9pt;width:242.25pt;height:110.6pt;z-index:251680768;visibility:visible;mso-wrap-style:square;mso-width-percent:0;mso-height-percent:200;mso-wrap-distance-left:9pt;mso-wrap-distance-top:3.6pt;mso-wrap-distance-right:9pt;mso-wrap-distance-bottom:3.6pt;mso-position-horizontal:center;mso-position-horizontal-relative:margin;mso-position-vertical:absolute;mso-position-vertical-relative:text;mso-width-percent:0;mso-height-percent:200;mso-width-relative:margin;mso-height-relative:margin;v-text-anchor:top" o:gfxdata="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" strokecolor="white [3212]">
+              <v:shape w14:anchorId="5BD06AE0" id="_x0000_s1027" type="#_x0000_t202" style="position:absolute;left:0;text-align:left;margin-left:0;margin-top:81.5pt;width:242.25pt;height:110.6pt;z-index:251684864;visibility:visible;mso-wrap-style:square;mso-width-percent:0;mso-height-percent:200;mso-wrap-distance-left:9pt;mso-wrap-distance-top:3.6pt;mso-wrap-distance-right:9pt;mso-wrap-distance-bottom:3.6pt;mso-position-horizontal:center;mso-position-horizontal-relative:margin;mso-position-vertical:absolute;mso-position-vertical-relative:text;mso-width-percent:0;mso-height-percent:200;mso-width-relative:margin;mso-height-relative:margin;v-text-anchor:top" o:gfxdata="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" strokecolor="white [3212]">
                 <v:textbox style="mso-fit-shape-to-text:t">
                   <w:txbxContent>
                     <w:p>
@@ -3566,7 +3365,13 @@
                         <w:rPr>
                           <w:rFonts w:ascii="Times New Roman" w:hAnsi="Times New Roman"/>
                         </w:rPr>
-                        <w:t>Вывод результата</w:t>
+                        <w:t>В</w:t>
+                      </w:r>
+                      <w:r>
+                        <w:rPr>
+                          <w:rFonts w:ascii="Times New Roman" w:hAnsi="Times New Roman"/>
+                        </w:rPr>
+                        <w:t>вод значений</w:t>
                       </w:r>
                     </w:p>
                   </w:txbxContent>
@@ -3581,20 +3386,22 @@
         <w:rPr>
           <w:rFonts w:ascii="Times New Roman" w:hAnsi="Times New Roman"/>
           <w:sz w:val="24"/>
+          <w:szCs w:val="22"/>
+          <w:u w:val="single"/>
         </w:rPr>
         <w:drawing>
-          <wp:anchor distT="0" distB="0" distL="114300" distR="114300" simplePos="0" relativeHeight="251678720" behindDoc="0" locked="0" layoutInCell="1" allowOverlap="1" wp14:anchorId="1ACCCE8D" wp14:editId="26B2D903">
+          <wp:anchor distT="0" distB="0" distL="114300" distR="114300" simplePos="0" relativeHeight="251682816" behindDoc="0" locked="0" layoutInCell="1" allowOverlap="1" wp14:anchorId="5FC3D5E3" wp14:editId="63B4B624">
             <wp:simplePos x="0" y="0"/>
             <wp:positionH relativeFrom="margin">
               <wp:align>center</wp:align>
             </wp:positionH>
             <wp:positionV relativeFrom="paragraph">
-              <wp:posOffset>649605</wp:posOffset>
+              <wp:posOffset>335915</wp:posOffset>
             </wp:positionV>
-            <wp:extent cx="1343212" cy="247685"/>
-            <wp:effectExtent l="0" t="0" r="0" b="0"/>
+            <wp:extent cx="4315427" cy="552527"/>
+            <wp:effectExtent l="0" t="0" r="9525" b="0"/>
             <wp:wrapTopAndBottom/>
-            <wp:docPr id="11" name="Picture 11"/>
+            <wp:docPr id="15" name="Picture 15"/>
             <wp:cNvGraphicFramePr>
               <a:graphicFrameLocks xmlns:a="http://schemas.openxmlformats.org/drawingml/2006/main" noChangeAspect="1"/>
             </wp:cNvGraphicFramePr>
@@ -3620,7 +3427,7 @@
                   <pic:spPr>
                     <a:xfrm>
                       <a:off x="0" y="0"/>
-                      <a:ext cx="1343212" cy="247685"/>
+                      <a:ext cx="4315427" cy="552527"/>
                     </a:xfrm>
                     <a:prstGeom prst="rect">
                       <a:avLst/>
@@ -3637,6 +3444,225 @@
           <w:rFonts w:ascii="Times New Roman" w:hAnsi="Times New Roman"/>
           <w:sz w:val="24"/>
           <w:szCs w:val="22"/>
+          <w:u w:val="single"/>
+        </w:rPr>
+        <w:t>Шаг 3: Задание значений переменных</w:t>
+      </w:r>
+    </w:p>
+    <w:p>
+      <w:pPr>
+        <w:spacing w:line="360" w:lineRule="auto"/>
+        <w:jc w:val="both"/>
+        <w:rPr>
+          <w:rFonts w:ascii="Times New Roman" w:hAnsi="Times New Roman"/>
+          <w:sz w:val="24"/>
+          <w:szCs w:val="22"/>
+        </w:rPr>
+      </w:pPr>
+      <w:r>
+        <w:rPr>
+          <w:rFonts w:ascii="Times New Roman" w:hAnsi="Times New Roman"/>
+          <w:sz w:val="24"/>
+          <w:szCs w:val="22"/>
+        </w:rPr>
+        <w:t>Теперь нужно указать, какие числа соответствуют переменным в вашем выражении. Выберите пункт "Ввести значения переменных".</w:t>
+      </w:r>
+    </w:p>
+    <w:p>
+      <w:pPr>
+        <w:spacing w:line="360" w:lineRule="auto"/>
+        <w:jc w:val="both"/>
+        <w:rPr>
+          <w:rFonts w:ascii="Times New Roman" w:hAnsi="Times New Roman"/>
+          <w:sz w:val="24"/>
+          <w:szCs w:val="22"/>
+        </w:rPr>
+      </w:pPr>
+      <w:r>
+        <w:rPr>
+          <w:rFonts w:ascii="Times New Roman" w:hAnsi="Times New Roman"/>
+          <w:sz w:val="24"/>
+          <w:szCs w:val="22"/>
+        </w:rPr>
+        <w:lastRenderedPageBreak/>
+        <w:t>Для каждой переменной:</w:t>
+      </w:r>
+    </w:p>
+    <w:p>
+      <w:pPr>
+        <w:spacing w:line="360" w:lineRule="auto"/>
+        <w:jc w:val="both"/>
+        <w:rPr>
+          <w:rFonts w:ascii="Times New Roman" w:hAnsi="Times New Roman"/>
+          <w:sz w:val="24"/>
+          <w:szCs w:val="22"/>
+        </w:rPr>
+      </w:pPr>
+      <w:r>
+        <w:rPr>
+          <w:rFonts w:ascii="Times New Roman" w:hAnsi="Times New Roman"/>
+          <w:sz w:val="24"/>
+          <w:szCs w:val="22"/>
+        </w:rPr>
+        <w:t>Введите имя переменной (одну букву)</w:t>
+      </w:r>
+    </w:p>
+    <w:p>
+      <w:pPr>
+        <w:spacing w:line="360" w:lineRule="auto"/>
+        <w:jc w:val="both"/>
+        <w:rPr>
+          <w:rFonts w:ascii="Times New Roman" w:hAnsi="Times New Roman"/>
+          <w:sz w:val="24"/>
+          <w:szCs w:val="22"/>
+        </w:rPr>
+      </w:pPr>
+      <w:r>
+        <w:rPr>
+          <w:rFonts w:ascii="Times New Roman" w:hAnsi="Times New Roman"/>
+          <w:sz w:val="24"/>
+          <w:szCs w:val="22"/>
+        </w:rPr>
+        <w:t>Введите ее числовое значение</w:t>
+      </w:r>
+    </w:p>
+    <w:p>
+      <w:pPr>
+        <w:spacing w:line="360" w:lineRule="auto"/>
+        <w:jc w:val="both"/>
+        <w:rPr>
+          <w:rFonts w:ascii="Times New Roman" w:hAnsi="Times New Roman"/>
+          <w:sz w:val="24"/>
+          <w:szCs w:val="22"/>
+        </w:rPr>
+      </w:pPr>
+      <w:r>
+        <w:rPr>
+          <w:rFonts w:ascii="Times New Roman" w:hAnsi="Times New Roman"/>
+          <w:sz w:val="24"/>
+          <w:szCs w:val="22"/>
+        </w:rPr>
+        <w:t>Повторите для всех переменных, которые есть в выражении</w:t>
+      </w:r>
+    </w:p>
+    <w:p>
+      <w:pPr>
+        <w:spacing w:line="360" w:lineRule="auto"/>
+        <w:jc w:val="both"/>
+        <w:rPr>
+          <w:rFonts w:ascii="Times New Roman" w:hAnsi="Times New Roman"/>
+          <w:sz w:val="24"/>
+          <w:szCs w:val="22"/>
+        </w:rPr>
+      </w:pPr>
+      <w:r>
+        <w:rPr>
+          <w:rFonts w:ascii="Times New Roman" w:hAnsi="Times New Roman"/>
+          <w:sz w:val="24"/>
+          <w:szCs w:val="22"/>
+        </w:rPr>
+        <w:t>Для завершения ввода введите </w:t>
+      </w:r>
+      <w:r>
+        <w:rPr>
+          <w:rFonts w:ascii="Times New Roman" w:eastAsiaTheme="majorEastAsia" w:hAnsi="Times New Roman"/>
+          <w:sz w:val="24"/>
+          <w:szCs w:val="22"/>
+        </w:rPr>
+        <w:t>0</w:t>
+      </w:r>
+    </w:p>
+    <w:p>
+      <w:pPr>
+        <w:spacing w:line="360" w:lineRule="auto"/>
+        <w:jc w:val="both"/>
+        <w:rPr>
+          <w:rFonts w:ascii="Times New Roman" w:hAnsi="Times New Roman"/>
+          <w:sz w:val="24"/>
+          <w:szCs w:val="22"/>
+        </w:rPr>
+      </w:pPr>
+      <w:r>
+        <w:rPr>
+          <w:rFonts w:ascii="Times New Roman" w:hAnsi="Times New Roman"/>
+          <w:sz w:val="24"/>
+          <w:szCs w:val="22"/>
+        </w:rPr>
+        <w:t>Если вы попробуете задать значение для символа, который не является строчной английской буквой, программа сообщит об ошибке.</w:t>
+      </w:r>
+      <w:r>
+        <w:rPr>
+          <w:rFonts w:ascii="Times New Roman" w:hAnsi="Times New Roman"/>
+          <w:sz w:val="24"/>
+          <w:szCs w:val="22"/>
+        </w:rPr>
+        <w:t xml:space="preserve"> Е</w:t>
+      </w:r>
+      <w:r>
+        <w:rPr>
+          <w:rFonts w:ascii="Times New Roman" w:hAnsi="Times New Roman"/>
+          <w:sz w:val="24"/>
+          <w:szCs w:val="22"/>
+        </w:rPr>
+        <w:t>сли в выражении есть переменные, которые вы не задали, при вычислении они будут считаться равными нулю.</w:t>
+      </w:r>
+    </w:p>
+    <w:p>
+      <w:pPr>
+        <w:spacing w:line="360" w:lineRule="auto"/>
+        <w:ind w:firstLine="708"/>
+        <w:jc w:val="both"/>
+        <w:rPr>
+          <w:rFonts w:ascii="Times New Roman" w:hAnsi="Times New Roman"/>
+          <w:sz w:val="24"/>
+          <w:szCs w:val="22"/>
+          <w:u w:val="single"/>
+        </w:rPr>
+      </w:pPr>
+      <w:r>
+        <w:rPr>
+          <w:rFonts w:ascii="Times New Roman" w:hAnsi="Times New Roman"/>
+          <w:sz w:val="24"/>
+          <w:szCs w:val="22"/>
+          <w:u w:val="single"/>
+        </w:rPr>
+        <w:t>Шаг 4: Вычисление результата</w:t>
+      </w:r>
+    </w:p>
+    <w:p>
+      <w:pPr>
+        <w:spacing w:line="360" w:lineRule="auto"/>
+        <w:jc w:val="both"/>
+        <w:rPr>
+          <w:rFonts w:ascii="Times New Roman" w:hAnsi="Times New Roman"/>
+          <w:sz w:val="24"/>
+          <w:szCs w:val="22"/>
+        </w:rPr>
+      </w:pPr>
+      <w:r>
+        <w:rPr>
+          <w:rFonts w:ascii="Times New Roman" w:hAnsi="Times New Roman"/>
+          <w:sz w:val="24"/>
+          <w:szCs w:val="22"/>
+        </w:rPr>
+        <w:t>Когда все готово, выберите пункт "Вычислить выражение". Программа подставит заданные значения переменных, выполнит вычисления и покажет результат.</w:t>
+      </w:r>
+    </w:p>
+    <w:p>
+      <w:pPr>
+        <w:spacing w:line="360" w:lineRule="auto"/>
+        <w:jc w:val="both"/>
+        <w:rPr>
+          <w:rFonts w:ascii="Times New Roman" w:hAnsi="Times New Roman"/>
+          <w:sz w:val="24"/>
+          <w:szCs w:val="22"/>
+        </w:rPr>
+      </w:pPr>
+      <w:r>
+        <w:rPr>
+          <w:rFonts w:ascii="Times New Roman" w:hAnsi="Times New Roman"/>
+          <w:sz w:val="24"/>
+          <w:szCs w:val="22"/>
         </w:rPr>
         <w:t>Если вы попробуете вычислить выражение до его преобразования в постфиксную форму, программа напомнит, что нужно сначала выполнить второй шаг.</w:t>
       </w:r>
@@ -3832,7 +3858,6 @@
           <w:sz w:val="36"/>
           <w:szCs w:val="36"/>
         </w:rPr>
-        <w:lastRenderedPageBreak/>
         <w:t>Описание программной реализации</w:t>
       </w:r>
       <w:bookmarkEnd w:id="6"/>
@@ -4599,6 +4624,7 @@
           <w:sz w:val="24"/>
           <w:szCs w:val="22"/>
         </w:rPr>
+        <w:lastRenderedPageBreak/>
         <w:t>Основная задача:</w:t>
       </w:r>
       <w:r>
@@ -4651,7 +4677,6 @@
           <w:sz w:val="24"/>
           <w:szCs w:val="22"/>
         </w:rPr>
-        <w:lastRenderedPageBreak/>
         <w:t>Гибкость и эффективность:</w:t>
       </w:r>
       <w:r>
@@ -5681,6 +5706,7 @@
           <w:sz w:val="24"/>
           <w:szCs w:val="24"/>
         </w:rPr>
+        <w:lastRenderedPageBreak/>
         <w:t>Преимуществашаблонного подхода:</w:t>
       </w:r>
     </w:p>
@@ -5735,7 +5761,6 @@
           <w:sz w:val="24"/>
           <w:szCs w:val="24"/>
         </w:rPr>
-        <w:lastRenderedPageBreak/>
         <w:t>Статическая типобезопасность</w:t>
       </w:r>
       <w:r>

</xml_diff>